<commit_message>
fixed a bunch of stuff based on suggestions
</commit_message>
<xml_diff>
--- a/personalU/product/artf.docx
+++ b/personalU/product/artf.docx
@@ -11,7 +11,7 @@
         <w:rPr/>
       </w:pPr>
       <w:r/>
-      <w:bookmarkStart w:id="27" w:name="摺紙藝術實體化挑戰-spring-into-action-放大計畫"/>
+      <w:bookmarkStart w:id="29" w:name="摺紙藝術實體化挑戰-spring-into-action-放大計畫"/>
       <w:r>
         <w:t xml:space="preserve">摺紙藝術實體化挑戰 — Spring into Action 放大計畫</w:t>
       </w:r>
@@ -158,9 +158,9 @@
         <w:rPr/>
       </w:pPr>
       <w:r/>
-      <w:bookmarkStart w:id="25" w:name="與-jeremy-shafer-的交流"/>
+      <w:bookmarkStart w:id="25" w:name="與-jeremy-shafer-的線上英文交流"/>
       <w:r>
-        <w:t xml:space="preserve">與 Jeremy Shafer 的交流</w:t>
+        <w:t xml:space="preserve">與 Jeremy Shafer 的線上英文交流</w:t>
       </w:r>
       <w:r/>
     </w:p>
@@ -187,7 +187,7 @@
         <w:rPr/>
       </w:pPr>
       <w:r/>
-      <w:bookmarkStart w:id="26" w:name="反思"/>
+      <w:bookmarkStart w:id="28" w:name="反思"/>
       <w:r>
         <w:t xml:space="preserve">反思</w:t>
       </w:r>
@@ -195,6 +195,21 @@
     </w:p>
     <w:p>
       <w:pPr>
+        <w:pStyle w:val="703"/>
+        <w:pBdr/>
+        <w:spacing/>
+        <w:ind/>
+        <w:rPr/>
+      </w:pPr>
+      <w:r/>
+      <w:bookmarkStart w:id="26" w:name="最早的放大衝動"/>
+      <w:r>
+        <w:t xml:space="preserve">最早的「放大」衝動</w:t>
+      </w:r>
+      <w:r/>
+    </w:p>
+    <w:p>
+      <w:pPr>
         <w:pStyle w:val="692"/>
         <w:pBdr/>
         <w:spacing/>
@@ -202,7 +217,36 @@
         <w:rPr/>
       </w:pPr>
       <w:r>
-        <w:t xml:space="preserve">這個作品從國二做到現在還放在家裡，是我最早的「看到有趣的東西就想自己做一個更大的版本」的實踐。回頭看，這個思維模式後來延伸到了程式開發。看到開源翻譯品質不好就自己寫工具解決，看到音樂管理不方便就自己架伺服器。差別只在於素材從紙張變成了程式碼，但「動手做」的衝動是同一個。</w:t>
+        <w:t xml:space="preserve">這個作品從國二做到現在還放在家裡，是我最早的「看到有趣的東西就想自己做一個更大的版本」的實踐。</w:t>
+      </w:r>
+      <w:bookmarkEnd w:id="26"/>
+      <w:r/>
+    </w:p>
+    <w:p>
+      <w:pPr>
+        <w:pStyle w:val="703"/>
+        <w:pBdr/>
+        <w:spacing/>
+        <w:ind/>
+        <w:rPr/>
+      </w:pPr>
+      <w:r/>
+      <w:bookmarkStart w:id="27" w:name="從紙張到程式碼"/>
+      <w:r>
+        <w:t xml:space="preserve">從紙張到程式碼</w:t>
+      </w:r>
+      <w:r/>
+    </w:p>
+    <w:p>
+      <w:pPr>
+        <w:pStyle w:val="692"/>
+        <w:pBdr/>
+        <w:spacing/>
+        <w:ind/>
+        <w:rPr/>
+      </w:pPr>
+      <w:r>
+        <w:t xml:space="preserve">回頭看，這個思維模式後來延伸到了程式開發。看到開源翻譯品質不好就自己寫工具解決，看到音樂管理不方便就自己架伺服器。差別只在於素材從紙張變成了程式碼，但「動手做」的衝動是同一個。</w:t>
       </w:r>
       <w:r/>
     </w:p>
@@ -219,7 +263,7 @@
           <mc:Choice Requires="wpg">
             <w:drawing>
               <wp:inline xmlns:wp="http://schemas.openxmlformats.org/drawingml/2006/wordprocessingDrawing" distT="0" distB="0" distL="0" distR="0">
-                <wp:extent cx="4893131" cy="6524175"/>
+                <wp:extent cx="3788250" cy="5051000"/>
                 <wp:effectExtent l="0" t="0" r="0" b="0"/>
                 <wp:docPr id="1" name=""/>
                 <wp:cNvGraphicFramePr>
@@ -229,7 +273,7 @@
                   <a:graphicData uri="http://schemas.openxmlformats.org/drawingml/2006/picture">
                     <pic:pic xmlns:pic="http://schemas.openxmlformats.org/drawingml/2006/picture">
                       <pic:nvPicPr>
-                        <pic:cNvPr id="1388908705" name=""/>
+                        <pic:cNvPr id="143855312" name=""/>
                         <pic:cNvPicPr>
                           <a:picLocks noChangeAspect="1"/>
                         </pic:cNvPicPr>
@@ -242,7 +286,7 @@
                       <pic:spPr bwMode="auto">
                         <a:xfrm flipH="0" flipV="0">
                           <a:off x="0" y="0"/>
-                          <a:ext cx="4893131" cy="6524174"/>
+                          <a:ext cx="3788249" cy="5050999"/>
                         </a:xfrm>
                         <a:prstGeom prst="rect">
                           <a:avLst/>
@@ -275,7 +319,7 @@
                 <v:path o:extrusionok="f" gradientshapeok="t" o:connecttype="rect"/>
                 <o:lock v:ext="edit" aspectratio="t"/>
               </v:shapetype>
-              <v:shape id="_x0000_i0" o:spid="_x0000_s0" type="#_x0000_t75" style="width:385.29pt;height:513.71pt;mso-wrap-distance-left:0.00pt;mso-wrap-distance-top:0.00pt;mso-wrap-distance-right:0.00pt;mso-wrap-distance-bottom:0.00pt;z-index:1;" stroked="false">
+              <v:shape id="_x0000_i0" o:spid="_x0000_s0" type="#_x0000_t75" style="width:298.29pt;height:397.72pt;mso-wrap-distance-left:0.00pt;mso-wrap-distance-top:0.00pt;mso-wrap-distance-right:0.00pt;mso-wrap-distance-bottom:0.00pt;z-index:1;" stroked="false">
                 <v:imagedata r:id="rId9" o:title=""/>
                 <o:lock v:ext="edit" rotation="t"/>
               </v:shape>

</xml_diff>